<commit_message>
wizard: wait until the vLM web UI is live and verify the admin login before finishing
</commit_message>
<xml_diff>
--- a/docs/CloudLens_vLM_AMI_AWS_GovCloud_Runbook.docx
+++ b/docs/CloudLens_vLM_AMI_AWS_GovCloud_Runbook.docx
@@ -1547,7 +1547,7 @@
           <w:i w:val="0"/>
           <w:sz w:val="21"/>
         </w:rPr>
-        <w:t>It shows a review, launches on your confirmation, waits for the instances to run, then prints each vLM public IP, the web UI URL, the administrator login, and the private IP to point your vPBs at.</w:t>
+        <w:t>It shows a review, launches on your confirmation, then waits until each vLM web UI is live on port 443 and verifies the administrator login, before printing each vLM public IP, the web UI URL, the login, and the private IP to point your vPBs at. When the wizard finishes, the vLM is reachable.</w:t>
       </w:r>
     </w:p>
     <w:p>
@@ -3880,20 +3880,18 @@
         <w:br/>
         <w:t>ok "launched: $IIDS"</w:t>
         <w:br/>
-        <w:t>note "waiting for running state ..."</w:t>
+        <w:t>note "waiting for the OS to boot ..."</w:t>
         <w:br/>
         <w:t>aws_ ec2 wait instance-running --instance-ids $IIDS 2&gt;/dev/null</w:t>
         <w:br/>
         <w:br/>
-        <w:t># ---- 9. summary ------------------------------------------------------------</w:t>
+        <w:t># ---- 9. bring the vLM online and verify ------------------------------------</w:t>
         <w:br/>
-        <w:t>step "9." "Deployment summary"</w:t>
+        <w:t>step "9." "Bringing the vLM online (this waits until the web UI answers)"</w:t>
         <w:br/>
-        <w:t>printf '\n  %s╔════════════════════════════════════════════════════════════╗%s\n' "$GRN" "$R"</w:t>
+        <w:t>printf '\n  %s================ Deployment summary ================%s\n\n' "$GRN$B" "$R"</w:t>
         <w:br/>
-        <w:t>printf '  %s║   CloudLens vLM is deploying. Access details below.        ║%s\n' "$GRN" "$R"</w:t>
-        <w:br/>
-        <w:t>printf '  %s╚════════════════════════════════════════════════════════════╝%s\n\n' "$GRN" "$R"</w:t>
+        <w:t>ALL_LIVE=true</w:t>
         <w:br/>
         <w:t>for id in $IIDS; do</w:t>
         <w:br/>
@@ -3901,23 +3899,55 @@
         <w:br/>
         <w:t xml:space="preserve">  prv=$(aws_ ec2 describe-instances --instance-ids "$id" --query 'Reservations[0].Instances[0].PrivateIpAddress' --output text 2&gt;/dev/null)</w:t>
         <w:br/>
-        <w:t xml:space="preserve">  printf '  %s%s%s\n' "$B" "$id" "$R"</w:t>
+        <w:t xml:space="preserve">  printf '  %s%s%s  %s%s%s ' "$B" "$id" "$R" "$DIM" "waiting for vLM UI on https://$pub" "$R"</w:t>
         <w:br/>
-        <w:t xml:space="preserve">  printf '     %s🌐 vLM UI %s  https://%s\n' "$CYN" "$R" "$pub"</w:t>
+        <w:t xml:space="preserve">  status="still initializing"; scol="$YEL"</w:t>
         <w:br/>
-        <w:t xml:space="preserve">  printf '     %s🔑 Login  %s  admin / admin   %s(change on first login)%s\n' "$CYN" "$R" "$DIM" "$R"</w:t>
+        <w:t xml:space="preserve">  for i in $(seq 1 48); do        # up to ~8 minutes</w:t>
         <w:br/>
-        <w:t xml:space="preserve">  printf '     %s🔒 Private%s  %s   %s(point your vPBs here to license)%s\n' "$CYN" "$R" "$prv" "$DIM" "$R"</w:t>
+        <w:t xml:space="preserve">    code=$(curl -sk -o /dev/null -w '%{http_code}' --max-time 5 "https://$pub/" 2&gt;/dev/null)</w:t>
+        <w:br/>
+        <w:t xml:space="preserve">    if [ "$code" = "200" ] || [ "$code" = "302" ]; then</w:t>
+        <w:br/>
+        <w:t xml:space="preserve">      login=$(curl -sk --max-time 6 -X POST --data-urlencode "userid=admin" --data-urlencode "password=admin" "https://$pub/rest/license/login" 2&gt;/dev/null)</w:t>
+        <w:br/>
+        <w:t xml:space="preserve">      case "$login" in</w:t>
+        <w:br/>
+        <w:t xml:space="preserve">        *'"success":true'*) status="LIVE - login verified (admin/admin)"; scol="$GRN";;</w:t>
+        <w:br/>
+        <w:t xml:space="preserve">        *) status="LIVE - web UI up";                                      scol="$GRN";;</w:t>
+        <w:br/>
+        <w:t xml:space="preserve">      esac</w:t>
+        <w:br/>
+        <w:t xml:space="preserve">      break</w:t>
+        <w:br/>
+        <w:t xml:space="preserve">    fi</w:t>
+        <w:br/>
+        <w:t xml:space="preserve">    printf '.'; sleep 10</w:t>
+        <w:br/>
+        <w:t xml:space="preserve">  done</w:t>
+        <w:br/>
+        <w:t xml:space="preserve">  [ "$scol" = "$YEL" ] &amp;&amp; ALL_LIVE=false</w:t>
+        <w:br/>
+        <w:t xml:space="preserve">  printf '\n'</w:t>
+        <w:br/>
+        <w:t xml:space="preserve">  printf '     %sStatus %s  %s%s%s\n' "$CYN" "$R" "$scol" "$status" "$R"</w:t>
+        <w:br/>
+        <w:t xml:space="preserve">  printf '     %svLM UI %s   https://%s\n' "$CYN" "$R" "$pub"</w:t>
+        <w:br/>
+        <w:t xml:space="preserve">  printf '     %sLogin  %s   admin / admin   %s(change on first login)%s\n' "$CYN" "$R" "$DIM" "$R"</w:t>
+        <w:br/>
+        <w:t xml:space="preserve">  printf '     %sPrivate%s   %s   %s(point your vPBs here to license)%s\n\n' "$CYN" "$R" "$prv" "$DIM" "$R"</w:t>
         <w:br/>
         <w:t>done</w:t>
         <w:br/>
-        <w:t>echo</w:t>
+        <w:t>if $ALL_LIVE; then ok "All vLM instances are LIVE and reachable."</w:t>
         <w:br/>
-        <w:t>note "The vLM web app takes ~2 to 4 minutes after boot to answer on 443."</w:t>
+        <w:t>else warn "Some instances are still initializing; the vLM app can take a few minutes. Re-open the URL shortly."; fi</w:t>
         <w:br/>
         <w:t>note "Teardown:  aws ec2 terminate-instances --instance-ids $IIDS ; aws ec2 delete-security-group --group-id $SG"</w:t>
         <w:br/>
-        <w:t>printf '\n  %s🚀  Done.%s\n\n' "$GRN$B" "$R"</w:t>
+        <w:t>printf '\n  %sDone.%s\n\n' "$GRN$B" "$R"</w:t>
         <w:br/>
       </w:r>
     </w:p>

</xml_diff>

<commit_message>
runbook: add the wizard review-screen figure
</commit_message>
<xml_diff>
--- a/docs/CloudLens_vLM_AMI_AWS_GovCloud_Runbook.docx
+++ b/docs/CloudLens_vLM_AMI_AWS_GovCloud_Runbook.docx
@@ -1550,6 +1550,59 @@
         <w:t>It shows a review, launches on your confirmation, then waits until each vLM web UI is live on port 443 and verifies the administrator login, before printing each vLM public IP, the web UI URL, the login, and the private IP to point your vPBs at. When the wizard finishes, the vLM is reachable.</w:t>
       </w:r>
     </w:p>
+    <w:p>
+      <w:pPr>
+        <w:jc w:val="center"/>
+      </w:pPr>
+      <w:r>
+        <w:drawing>
+          <wp:inline xmlns:a="http://schemas.openxmlformats.org/drawingml/2006/main" xmlns:pic="http://schemas.openxmlformats.org/drawingml/2006/picture">
+            <wp:extent cx="6035040" cy="3621024"/>
+            <wp:docPr id="3" name="Picture 3"/>
+            <wp:cNvGraphicFramePr>
+              <a:graphicFrameLocks noChangeAspect="1"/>
+            </wp:cNvGraphicFramePr>
+            <a:graphic>
+              <a:graphicData uri="http://schemas.openxmlformats.org/drawingml/2006/picture">
+                <pic:pic>
+                  <pic:nvPicPr>
+                    <pic:cNvPr id="0" name="pipe.png"/>
+                    <pic:cNvPicPr/>
+                  </pic:nvPicPr>
+                  <pic:blipFill>
+                    <a:blip r:embed="rId13"/>
+                    <a:stretch>
+                      <a:fillRect/>
+                    </a:stretch>
+                  </pic:blipFill>
+                  <pic:spPr>
+                    <a:xfrm>
+                      <a:off x="0" y="0"/>
+                      <a:ext cx="6035040" cy="3621024"/>
+                    </a:xfrm>
+                    <a:prstGeom prst="rect"/>
+                  </pic:spPr>
+                </pic:pic>
+              </a:graphicData>
+            </a:graphic>
+          </wp:inline>
+        </w:drawing>
+      </w:r>
+    </w:p>
+    <w:p>
+      <w:pPr>
+        <w:jc w:val="center"/>
+      </w:pPr>
+      <w:r>
+        <w:rPr>
+          <w:i/>
+          <w:color w:val="556575"/>
+          <w:sz w:val="18"/>
+        </w:rPr>
+        <w:t>Figure 3. The wizard collects the key pair, subnet, and access scope, then shows a clear review of every choice before it launches. Recommended options are the default in brackets, so pressing Enter accepts them.</w:t>
+      </w:r>
+    </w:p>
+    <w:p/>
     <w:p>
       <w:pPr>
         <w:spacing w:after="60"/>

</xml_diff>